<commit_message>
1 laba debug otchet
</commit_message>
<xml_diff>
--- a/1 laba/Отчет_1laba_Шленский.docx
+++ b/1 laba/Отчет_1laba_Шленский.docx
@@ -167,13 +167,7 @@
       </w:r>
       <w:proofErr w:type="spellEnd"/>
       <w:r>
-        <w:t xml:space="preserve"> А.</w:t>
-      </w:r>
-      <w:r>
-        <w:t>В</w:t>
-      </w:r>
-      <w:r>
-        <w:t>.</w:t>
+        <w:t xml:space="preserve"> А.В.</w:t>
       </w:r>
     </w:p>
     <w:p>
@@ -1291,6 +1285,9 @@
         <w:spacing w:after="120" w:line="360" w:lineRule="auto"/>
       </w:pPr>
       <w:r>
+        <w:rPr>
+          <w:noProof/>
+        </w:rPr>
         <w:drawing>
           <wp:inline distT="0" distB="0" distL="0" distR="0" wp14:anchorId="6600BE84" wp14:editId="77BF58F5">
             <wp:extent cx="5940425" cy="3194685"/>
@@ -1339,21 +1336,17 @@
           <w:bCs/>
         </w:rPr>
         <w:lastRenderedPageBreak/>
-        <w:t>Рисунок</w:t>
-      </w:r>
-      <w:r>
-        <w:rPr>
-          <w:b/>
-          <w:bCs/>
-        </w:rPr>
-        <w:t xml:space="preserve"> 2 — Студенты</w:t>
-      </w:r>
-    </w:p>
-    <w:p>
-      <w:pPr>
-        <w:spacing w:after="120" w:line="360" w:lineRule="auto"/>
-      </w:pPr>
-      <w:r>
+        <w:t>Рисунок 2 — Студенты</w:t>
+      </w:r>
+    </w:p>
+    <w:p>
+      <w:pPr>
+        <w:spacing w:after="120" w:line="360" w:lineRule="auto"/>
+      </w:pPr>
+      <w:r>
+        <w:rPr>
+          <w:noProof/>
+        </w:rPr>
         <w:drawing>
           <wp:inline distT="0" distB="0" distL="0" distR="0" wp14:anchorId="70802497" wp14:editId="4FDD44F5">
             <wp:extent cx="5940425" cy="3173730"/>
@@ -1401,21 +1394,17 @@
           <w:b/>
           <w:bCs/>
         </w:rPr>
-        <w:t>Рисунок</w:t>
-      </w:r>
-      <w:r>
-        <w:rPr>
-          <w:b/>
-          <w:bCs/>
-        </w:rPr>
-        <w:t xml:space="preserve"> 3 — Дисциплины</w:t>
-      </w:r>
-    </w:p>
-    <w:p>
-      <w:pPr>
-        <w:spacing w:after="120" w:line="360" w:lineRule="auto"/>
-      </w:pPr>
-      <w:r>
+        <w:t>Рисунок 3 — Дисциплины</w:t>
+      </w:r>
+    </w:p>
+    <w:p>
+      <w:pPr>
+        <w:spacing w:after="120" w:line="360" w:lineRule="auto"/>
+      </w:pPr>
+      <w:r>
+        <w:rPr>
+          <w:noProof/>
+        </w:rPr>
         <w:drawing>
           <wp:inline distT="0" distB="0" distL="0" distR="0" wp14:anchorId="653377B9" wp14:editId="7F3A3FDE">
             <wp:extent cx="5940425" cy="3184525"/>
@@ -1463,14 +1452,7 @@
           <w:b/>
           <w:bCs/>
         </w:rPr>
-        <w:t>Рисунок</w:t>
-      </w:r>
-      <w:r>
-        <w:rPr>
-          <w:b/>
-          <w:bCs/>
-        </w:rPr>
-        <w:t xml:space="preserve"> 4 — Успеваемость</w:t>
+        <w:t>Рисунок 4 — Успеваемость</w:t>
       </w:r>
     </w:p>
     <w:p>
@@ -1512,6 +1494,9 @@
         <w:spacing w:after="120" w:line="360" w:lineRule="auto"/>
       </w:pPr>
       <w:r>
+        <w:rPr>
+          <w:noProof/>
+        </w:rPr>
         <w:drawing>
           <wp:inline distT="0" distB="0" distL="0" distR="0" wp14:anchorId="43C3BADC" wp14:editId="63484FA4">
             <wp:extent cx="5940425" cy="2611755"/>
@@ -1721,35 +1706,17 @@
           <w:b/>
           <w:bCs/>
         </w:rPr>
-        <w:t xml:space="preserve">Рисунок 6 </w:t>
-      </w:r>
-      <w:r>
-        <w:rPr>
-          <w:b/>
-          <w:bCs/>
-        </w:rPr>
-        <w:t>—</w:t>
-      </w:r>
-      <w:r>
-        <w:rPr>
-          <w:b/>
-          <w:bCs/>
-        </w:rPr>
-        <w:t xml:space="preserve"> </w:t>
-      </w:r>
-      <w:r>
-        <w:rPr>
-          <w:b/>
-          <w:bCs/>
-        </w:rPr>
-        <w:t>Группы студентов</w:t>
-      </w:r>
-    </w:p>
-    <w:p>
-      <w:pPr>
-        <w:spacing w:after="120" w:line="360" w:lineRule="auto"/>
-      </w:pPr>
-      <w:r>
+        <w:t>Рисунок 6 — Группы студентов</w:t>
+      </w:r>
+    </w:p>
+    <w:p>
+      <w:pPr>
+        <w:spacing w:after="120" w:line="360" w:lineRule="auto"/>
+      </w:pPr>
+      <w:r>
+        <w:rPr>
+          <w:noProof/>
+        </w:rPr>
         <w:lastRenderedPageBreak/>
         <w:drawing>
           <wp:inline distT="0" distB="0" distL="0" distR="0" wp14:anchorId="5320B988" wp14:editId="5E9B7D37">
@@ -1798,35 +1765,17 @@
           <w:b/>
           <w:bCs/>
         </w:rPr>
-        <w:t xml:space="preserve">Рисунок 7 </w:t>
-      </w:r>
-      <w:r>
-        <w:rPr>
-          <w:b/>
-          <w:bCs/>
-        </w:rPr>
-        <w:t>—</w:t>
-      </w:r>
-      <w:r>
-        <w:rPr>
-          <w:b/>
-          <w:bCs/>
-        </w:rPr>
-        <w:t xml:space="preserve"> </w:t>
-      </w:r>
-      <w:r>
-        <w:rPr>
-          <w:b/>
-          <w:bCs/>
-        </w:rPr>
-        <w:t>Студенты</w:t>
-      </w:r>
-    </w:p>
-    <w:p>
-      <w:pPr>
-        <w:spacing w:after="120" w:line="360" w:lineRule="auto"/>
-      </w:pPr>
-      <w:r>
+        <w:t>Рисунок 7 — Студенты</w:t>
+      </w:r>
+    </w:p>
+    <w:p>
+      <w:pPr>
+        <w:spacing w:after="120" w:line="360" w:lineRule="auto"/>
+      </w:pPr>
+      <w:r>
+        <w:rPr>
+          <w:noProof/>
+        </w:rPr>
         <w:drawing>
           <wp:inline distT="0" distB="0" distL="0" distR="0" wp14:anchorId="172E007F" wp14:editId="5AD5CDAB">
             <wp:extent cx="3791479" cy="2305372"/>
@@ -1874,35 +1823,17 @@
           <w:b/>
           <w:bCs/>
         </w:rPr>
-        <w:t xml:space="preserve">Рисунок 8 </w:t>
-      </w:r>
-      <w:r>
-        <w:rPr>
-          <w:b/>
-          <w:bCs/>
-        </w:rPr>
-        <w:t>—</w:t>
-      </w:r>
-      <w:r>
-        <w:rPr>
-          <w:b/>
-          <w:bCs/>
-        </w:rPr>
-        <w:t xml:space="preserve"> </w:t>
-      </w:r>
-      <w:r>
-        <w:rPr>
-          <w:b/>
-          <w:bCs/>
-        </w:rPr>
-        <w:t>Дисциплины</w:t>
-      </w:r>
-    </w:p>
-    <w:p>
-      <w:pPr>
-        <w:spacing w:after="120" w:line="360" w:lineRule="auto"/>
-      </w:pPr>
-      <w:r>
+        <w:t>Рисунок 8 — Дисциплины</w:t>
+      </w:r>
+    </w:p>
+    <w:p>
+      <w:pPr>
+        <w:spacing w:after="120" w:line="360" w:lineRule="auto"/>
+      </w:pPr>
+      <w:r>
+        <w:rPr>
+          <w:noProof/>
+        </w:rPr>
         <w:drawing>
           <wp:inline distT="0" distB="0" distL="0" distR="0" wp14:anchorId="05A238D7" wp14:editId="3B6B35FB">
             <wp:extent cx="5858693" cy="2562583"/>
@@ -1950,28 +1881,7 @@
           <w:b/>
           <w:bCs/>
         </w:rPr>
-        <w:t xml:space="preserve">Рисунок 9 </w:t>
-      </w:r>
-      <w:r>
-        <w:rPr>
-          <w:b/>
-          <w:bCs/>
-        </w:rPr>
-        <w:t>—</w:t>
-      </w:r>
-      <w:r>
-        <w:rPr>
-          <w:b/>
-          <w:bCs/>
-        </w:rPr>
-        <w:t xml:space="preserve"> </w:t>
-      </w:r>
-      <w:r>
-        <w:rPr>
-          <w:b/>
-          <w:bCs/>
-        </w:rPr>
-        <w:t>Успеваемость</w:t>
+        <w:t>Рисунок 9 — Успеваемость</w:t>
       </w:r>
       <w:r>
         <w:br w:type="page"/>
@@ -2144,21 +2054,7 @@
           <w:b/>
           <w:bCs/>
         </w:rPr>
-        <w:t xml:space="preserve">Рисунок </w:t>
-      </w:r>
-      <w:r>
-        <w:rPr>
-          <w:b/>
-          <w:bCs/>
-        </w:rPr>
-        <w:t>10</w:t>
-      </w:r>
-      <w:r>
-        <w:rPr>
-          <w:b/>
-          <w:bCs/>
-        </w:rPr>
-        <w:t xml:space="preserve"> — Успеваемость студентов</w:t>
+        <w:t>Рисунок 10 — Успеваемость студентов</w:t>
       </w:r>
     </w:p>
     <w:p>
@@ -2270,21 +2166,7 @@
           <w:b/>
           <w:bCs/>
         </w:rPr>
-        <w:t>Рисунок 1</w:t>
-      </w:r>
-      <w:r>
-        <w:rPr>
-          <w:b/>
-          <w:bCs/>
-        </w:rPr>
-        <w:t>1</w:t>
-      </w:r>
-      <w:r>
-        <w:rPr>
-          <w:b/>
-          <w:bCs/>
-        </w:rPr>
-        <w:t xml:space="preserve"> — Успеваемость студентов по фамилии</w:t>
+        <w:t>Рисунок 11 — Успеваемость студентов по фамилии</w:t>
       </w:r>
     </w:p>
     <w:p>
@@ -2975,6 +2857,7 @@
   <w:style w:type="character" w:default="1" w:styleId="a0">
     <w:name w:val="Default Paragraph Font"/>
     <w:uiPriority w:val="1"/>
+    <w:semiHidden/>
     <w:unhideWhenUsed/>
   </w:style>
   <w:style w:type="table" w:default="1" w:styleId="a1">

</xml_diff>